<commit_message>
Freeze Journal of Intensive Care submission release v1.0
</commit_message>
<xml_diff>
--- a/submission/manuscript_files/STROBE_checklist_cohort_completed.docx
+++ b/submission/manuscript_files/STROBE_checklist_cohort_completed.docx
@@ -29,77 +29,10 @@
       </w:pPr>
       <w:r>
         <w:rPr>
-          <w:rFonts w:ascii="Times New Roman" w:hAnsi="Times New Roman" w:cs="Times New Roman"/>
+          <w:rFonts w:ascii="Times New Roman" w:eastAsia="Times New Roman" w:hAnsi="Times New Roman"/>
           <w:sz w:val="16"/>
-          <w:szCs w:val="16"/>
         </w:rPr>
-        <w:t xml:space="preserve">Manuscript: Landmark-specific transcriptomic and proteomic </w:t>
-      </w:r>
-      <w:r>
-        <w:rPr>
-          <w:rFonts w:ascii="Times New Roman" w:hAnsi="Times New Roman" w:cs="Times New Roman" w:hint="eastAsia"/>
-          <w:sz w:val="16"/>
-          <w:szCs w:val="16"/>
-        </w:rPr>
-        <w:t>associations</w:t>
-      </w:r>
-      <w:r>
-        <w:rPr>
-          <w:rFonts w:ascii="Times New Roman" w:hAnsi="Times New Roman" w:cs="Times New Roman"/>
-          <w:sz w:val="16"/>
-          <w:szCs w:val="16"/>
-        </w:rPr>
-        <w:t xml:space="preserve"> with </w:t>
-      </w:r>
-      <w:r>
-        <w:rPr>
-          <w:rFonts w:ascii="Times New Roman" w:hAnsi="Times New Roman" w:cs="Times New Roman" w:hint="eastAsia"/>
-          <w:sz w:val="16"/>
-          <w:szCs w:val="16"/>
-        </w:rPr>
-        <w:t xml:space="preserve">60-day </w:t>
-      </w:r>
-      <w:r>
-        <w:rPr>
-          <w:rFonts w:ascii="Times New Roman" w:hAnsi="Times New Roman" w:cs="Times New Roman"/>
-          <w:sz w:val="16"/>
-          <w:szCs w:val="16"/>
-        </w:rPr>
-        <w:t xml:space="preserve">mortality in </w:t>
-      </w:r>
-      <w:r>
-        <w:rPr>
-          <w:rFonts w:ascii="Times New Roman" w:hAnsi="Times New Roman" w:cs="Times New Roman" w:hint="eastAsia"/>
-          <w:sz w:val="16"/>
-          <w:szCs w:val="16"/>
-        </w:rPr>
-        <w:t>D</w:t>
-      </w:r>
-      <w:r>
-        <w:rPr>
-          <w:rFonts w:ascii="Times New Roman" w:hAnsi="Times New Roman" w:cs="Times New Roman"/>
-          <w:sz w:val="16"/>
-          <w:szCs w:val="16"/>
-        </w:rPr>
-        <w:t xml:space="preserve">ay-1-defined sepsis-induced coagulopathy: a </w:t>
-      </w:r>
-      <w:proofErr w:type="spellStart"/>
-      <w:r>
-        <w:rPr>
-          <w:rFonts w:ascii="Times New Roman" w:hAnsi="Times New Roman" w:cs="Times New Roman"/>
-          <w:sz w:val="16"/>
-          <w:szCs w:val="16"/>
-        </w:rPr>
-        <w:t>multicentre</w:t>
-      </w:r>
-      <w:proofErr w:type="spellEnd"/>
-      <w:r>
-        <w:rPr>
-          <w:rFonts w:ascii="Times New Roman" w:hAnsi="Times New Roman" w:cs="Times New Roman"/>
-          <w:sz w:val="16"/>
-          <w:szCs w:val="16"/>
-        </w:rPr>
-        <w:t xml:space="preserve"> longitudinal cohort study</w:t>
+        <w:t>Manuscript: Landmark-specific transcriptomic and proteomic associations with 60-day mortality in Day-1-defined sepsis-induced coagulopathy: a multicentre longitudinal cohort study</w:t>
       </w:r>
     </w:p>
     <w:p>
@@ -113,28 +46,10 @@
       </w:pPr>
       <w:r>
         <w:rPr>
-          <w:rFonts w:ascii="Times New Roman" w:hAnsi="Times New Roman" w:cs="Times New Roman"/>
+          <w:rFonts w:ascii="Times New Roman" w:eastAsia="Times New Roman" w:hAnsi="Times New Roman"/>
           <w:sz w:val="16"/>
-          <w:szCs w:val="16"/>
         </w:rPr>
-        <w:t>Reporting guideline: STROBE cohort checklist (https://www.strobe-statement.org/checklists/; accessed 2</w:t>
-      </w:r>
-      <w:r>
-        <w:rPr>
-          <w:rFonts w:ascii="Times New Roman" w:eastAsia="宋体" w:hAnsi="Times New Roman" w:cs="Times New Roman" w:hint="eastAsia"/>
-          <w:sz w:val="16"/>
-          <w:szCs w:val="16"/>
-          <w:lang w:eastAsia="zh-CN"/>
-        </w:rPr>
-        <w:t>1</w:t>
-      </w:r>
-      <w:r>
-        <w:rPr>
-          <w:rFonts w:ascii="Times New Roman" w:hAnsi="Times New Roman" w:cs="Times New Roman"/>
-          <w:sz w:val="16"/>
-          <w:szCs w:val="16"/>
-        </w:rPr>
-        <w:t xml:space="preserve"> July 2026). Page numbers refer to the clean Journal of Intensive Care manuscript supplied with this checklist. Additional file 1 contains Supplementary Methods and Figures; Additional file 2 contains Supplementary Tables S1–S8.</w:t>
+        <w:t>Reporting guideline: STROBE cohort checklist (https://www.strobe-statement.org/checklists/; accessed 22 July 2026). Page numbers refer to JIC_722_final_manuscript.docx. Additional file 1 contains Supplementary Methods and Figures; Additional file 2 contains Supplementary Tables S1–S8.</w:t>
       </w:r>
     </w:p>
     <w:tbl>
@@ -158,7 +73,6 @@
         <w:tc>
           <w:tcPr>
             <w:tcW w:w="2041" w:type="dxa"/>
-            <w:shd w:val="clear" w:color="auto" w:fill="D9EAF7"/>
             <w:vAlign w:val="center"/>
           </w:tcPr>
           <w:p>
@@ -180,7 +94,6 @@
         <w:tc>
           <w:tcPr>
             <w:tcW w:w="850" w:type="dxa"/>
-            <w:shd w:val="clear" w:color="auto" w:fill="D9EAF7"/>
             <w:vAlign w:val="center"/>
           </w:tcPr>
           <w:p>
@@ -202,7 +115,6 @@
         <w:tc>
           <w:tcPr>
             <w:tcW w:w="5669" w:type="dxa"/>
-            <w:shd w:val="clear" w:color="auto" w:fill="D9EAF7"/>
             <w:vAlign w:val="center"/>
           </w:tcPr>
           <w:p>
@@ -224,7 +136,6 @@
         <w:tc>
           <w:tcPr>
             <w:tcW w:w="6236" w:type="dxa"/>
-            <w:shd w:val="clear" w:color="auto" w:fill="D9EAF7"/>
             <w:vAlign w:val="center"/>
           </w:tcPr>
           <w:p>
@@ -338,29 +249,11 @@
             </w:pPr>
             <w:r>
               <w:rPr>
-                <w:rFonts w:ascii="Times New Roman" w:hAnsi="Times New Roman" w:cs="Times New Roman"/>
-                <w:sz w:val="16"/>
-                <w:szCs w:val="16"/>
-              </w:rPr>
-              <w:t xml:space="preserve">p. 1 (title: </w:t>
-            </w:r>
-            <w:proofErr w:type="spellStart"/>
-            <w:r>
-              <w:rPr>
-                <w:rFonts w:ascii="Times New Roman" w:hAnsi="Times New Roman" w:cs="Times New Roman"/>
-                <w:sz w:val="16"/>
-                <w:szCs w:val="16"/>
-              </w:rPr>
-              <w:t>multicentre</w:t>
-            </w:r>
-            <w:proofErr w:type="spellEnd"/>
-            <w:r>
-              <w:rPr>
-                <w:rFonts w:ascii="Times New Roman" w:hAnsi="Times New Roman" w:cs="Times New Roman"/>
-                <w:sz w:val="16"/>
-                <w:szCs w:val="16"/>
-              </w:rPr>
-              <w:t xml:space="preserve"> longitudinal cohort study)</w:t>
+                <w:rFonts w:ascii="Times New Roman" w:eastAsia="Times New Roman" w:hAnsi="Times New Roman" w:cs="Times New Roman"/>
+                <w:sz w:val="16"/>
+                <w:szCs w:val="16"/>
+              </w:rPr>
+              <w:t>p. 1 (title: multicentre longitudinal cohort study)</w:t>
             </w:r>
           </w:p>
         </w:tc>
@@ -459,7 +352,7 @@
             </w:pPr>
             <w:r>
               <w:rPr>
-                <w:rFonts w:ascii="Times New Roman" w:hAnsi="Times New Roman" w:cs="Times New Roman"/>
+                <w:rFonts w:ascii="Times New Roman" w:eastAsia="Times New Roman" w:hAnsi="Times New Roman" w:cs="Times New Roman"/>
                 <w:sz w:val="16"/>
                 <w:szCs w:val="16"/>
               </w:rPr>
@@ -562,7 +455,7 @@
             </w:pPr>
             <w:r>
               <w:rPr>
-                <w:rFonts w:ascii="Times New Roman" w:hAnsi="Times New Roman" w:cs="Times New Roman"/>
+                <w:rFonts w:ascii="Times New Roman" w:eastAsia="Times New Roman" w:hAnsi="Times New Roman" w:cs="Times New Roman"/>
                 <w:sz w:val="16"/>
                 <w:szCs w:val="16"/>
               </w:rPr>
@@ -665,7 +558,7 @@
             </w:pPr>
             <w:r>
               <w:rPr>
-                <w:rFonts w:ascii="Times New Roman" w:hAnsi="Times New Roman" w:cs="Times New Roman"/>
+                <w:rFonts w:ascii="Times New Roman" w:eastAsia="Times New Roman" w:hAnsi="Times New Roman" w:cs="Times New Roman"/>
                 <w:sz w:val="16"/>
                 <w:szCs w:val="16"/>
               </w:rPr>
@@ -768,29 +661,11 @@
             </w:pPr>
             <w:r>
               <w:rPr>
-                <w:rFonts w:ascii="Times New Roman" w:hAnsi="Times New Roman" w:cs="Times New Roman"/>
-                <w:sz w:val="16"/>
-                <w:szCs w:val="16"/>
-              </w:rPr>
-              <w:t xml:space="preserve">pp. 5–6 (Study design and data source; Analytic framework and </w:t>
-            </w:r>
-            <w:proofErr w:type="spellStart"/>
-            <w:r>
-              <w:rPr>
-                <w:rFonts w:ascii="Times New Roman" w:hAnsi="Times New Roman" w:cs="Times New Roman"/>
-                <w:sz w:val="16"/>
-                <w:szCs w:val="16"/>
-              </w:rPr>
-              <w:t>estimands</w:t>
-            </w:r>
-            <w:proofErr w:type="spellEnd"/>
-            <w:r>
-              <w:rPr>
-                <w:rFonts w:ascii="Times New Roman" w:hAnsi="Times New Roman" w:cs="Times New Roman"/>
-                <w:sz w:val="16"/>
-                <w:szCs w:val="16"/>
-              </w:rPr>
-              <w:t>)</w:t>
+                <w:rFonts w:ascii="Times New Roman" w:eastAsia="Times New Roman" w:hAnsi="Times New Roman" w:cs="Times New Roman"/>
+                <w:sz w:val="16"/>
+                <w:szCs w:val="16"/>
+              </w:rPr>
+              <w:t>pp. 5–6 (Study design and data source; Analytic framework and estimands)</w:t>
             </w:r>
           </w:p>
         </w:tc>
@@ -889,11 +764,11 @@
             </w:pPr>
             <w:r>
               <w:rPr>
-                <w:rFonts w:ascii="Times New Roman" w:hAnsi="Times New Roman" w:cs="Times New Roman"/>
-                <w:sz w:val="16"/>
-                <w:szCs w:val="16"/>
-              </w:rPr>
-              <w:t>pp. 5–8 (43 tertiary hospitals; November 2020–November 2024; 60-day follow-up; molecular sampling)</w:t>
+                <w:rFonts w:ascii="Times New Roman" w:eastAsia="Times New Roman" w:hAnsi="Times New Roman" w:cs="Times New Roman"/>
+                <w:sz w:val="16"/>
+                <w:szCs w:val="16"/>
+              </w:rPr>
+              <w:t>pp. 5–8 (43 tertiary hospitals; November 2020–November 2024; 60-day follow-up; Days 1, 3 and 5 molecular sampling)</w:t>
             </w:r>
           </w:p>
         </w:tc>
@@ -992,11 +867,11 @@
             </w:pPr>
             <w:r>
               <w:rPr>
-                <w:rFonts w:ascii="Times New Roman" w:hAnsi="Times New Roman" w:cs="Times New Roman"/>
-                <w:sz w:val="16"/>
-                <w:szCs w:val="16"/>
-              </w:rPr>
-              <w:t>pp. 6–7 and 14–15; Figure 1</w:t>
+                <w:rFonts w:ascii="Times New Roman" w:eastAsia="Times New Roman" w:hAnsi="Times New Roman" w:cs="Times New Roman"/>
+                <w:sz w:val="16"/>
+                <w:szCs w:val="16"/>
+              </w:rPr>
+              <w:t>pp. 6–7 and 15–17; Figure 1</w:t>
             </w:r>
           </w:p>
         </w:tc>
@@ -1095,7 +970,7 @@
             </w:pPr>
             <w:r>
               <w:rPr>
-                <w:rFonts w:ascii="Times New Roman" w:hAnsi="Times New Roman" w:cs="Times New Roman"/>
+                <w:rFonts w:ascii="Times New Roman" w:eastAsia="Times New Roman" w:hAnsi="Times New Roman" w:cs="Times New Roman"/>
                 <w:sz w:val="16"/>
                 <w:szCs w:val="16"/>
               </w:rPr>
@@ -1198,11 +1073,11 @@
             </w:pPr>
             <w:r>
               <w:rPr>
-                <w:rFonts w:ascii="Times New Roman" w:hAnsi="Times New Roman" w:cs="Times New Roman"/>
-                <w:sz w:val="16"/>
-                <w:szCs w:val="16"/>
-              </w:rPr>
-              <w:t>pp. 6–13; Supplementary Table S1</w:t>
+                <w:rFonts w:ascii="Times New Roman" w:eastAsia="Times New Roman" w:hAnsi="Times New Roman" w:cs="Times New Roman"/>
+                <w:sz w:val="16"/>
+                <w:szCs w:val="16"/>
+              </w:rPr>
+              <w:t>pp. 6–14; Supplementary Table S1</w:t>
             </w:r>
           </w:p>
         </w:tc>
@@ -1301,11 +1176,11 @@
             </w:pPr>
             <w:r>
               <w:rPr>
-                <w:rFonts w:ascii="Times New Roman" w:hAnsi="Times New Roman" w:cs="Times New Roman"/>
-                <w:sz w:val="16"/>
-                <w:szCs w:val="16"/>
-              </w:rPr>
-              <w:t>pp. 7–8; Additional file 1 (Supplementary Methods)</w:t>
+                <w:rFonts w:ascii="Times New Roman" w:eastAsia="Times New Roman" w:hAnsi="Times New Roman" w:cs="Times New Roman"/>
+                <w:sz w:val="16"/>
+                <w:szCs w:val="16"/>
+              </w:rPr>
+              <w:t>pp. 7–9; Additional file 1 (Supplementary Methods)</w:t>
             </w:r>
           </w:p>
         </w:tc>
@@ -1404,29 +1279,11 @@
             </w:pPr>
             <w:r>
               <w:rPr>
-                <w:rFonts w:ascii="Times New Roman" w:hAnsi="Times New Roman" w:cs="Times New Roman"/>
-                <w:sz w:val="16"/>
-                <w:szCs w:val="16"/>
-              </w:rPr>
-              <w:t xml:space="preserve">pp. 6–13 (delayed entry, </w:t>
-            </w:r>
-            <w:proofErr w:type="spellStart"/>
-            <w:r>
-              <w:rPr>
-                <w:rFonts w:ascii="Times New Roman" w:hAnsi="Times New Roman" w:cs="Times New Roman"/>
-                <w:sz w:val="16"/>
-                <w:szCs w:val="16"/>
-              </w:rPr>
-              <w:t>centre</w:t>
-            </w:r>
-            <w:proofErr w:type="spellEnd"/>
-            <w:r>
-              <w:rPr>
-                <w:rFonts w:ascii="Times New Roman" w:hAnsi="Times New Roman" w:cs="Times New Roman"/>
-                <w:sz w:val="16"/>
-                <w:szCs w:val="16"/>
-              </w:rPr>
-              <w:t xml:space="preserve"> stratification, PH and intensity sensitivity analyses, and availability/IPW); pp. 33–34</w:t>
+                <w:rFonts w:ascii="Times New Roman" w:eastAsia="Times New Roman" w:hAnsi="Times New Roman" w:cs="Times New Roman"/>
+                <w:sz w:val="16"/>
+                <w:szCs w:val="16"/>
+              </w:rPr>
+              <w:t>pp. 6–14 (delayed entry, centre stratification, PH and intensity sensitivity analyses, and Day-5 availability/IPW); pp. 35–39</w:t>
             </w:r>
           </w:p>
         </w:tc>
@@ -1525,11 +1382,11 @@
             </w:pPr>
             <w:r>
               <w:rPr>
-                <w:rFonts w:ascii="Times New Roman" w:hAnsi="Times New Roman" w:cs="Times New Roman"/>
-                <w:sz w:val="16"/>
-                <w:szCs w:val="16"/>
-              </w:rPr>
-              <w:t>p. 6 (all patients in the available Day-1 SIC analytic source cohort and all available molecular measurements; no prospective sample-size calculation)</w:t>
+                <w:rFonts w:ascii="Times New Roman" w:eastAsia="Times New Roman" w:hAnsi="Times New Roman" w:cs="Times New Roman"/>
+                <w:sz w:val="16"/>
+                <w:szCs w:val="16"/>
+              </w:rPr>
+              <w:t>p. 6 (all eligible patients and available molecular measurements were included; no prospective sample-size calculation)</w:t>
             </w:r>
           </w:p>
         </w:tc>
@@ -1628,11 +1485,11 @@
             </w:pPr>
             <w:r>
               <w:rPr>
-                <w:rFonts w:ascii="Times New Roman" w:hAnsi="Times New Roman" w:cs="Times New Roman"/>
-                <w:sz w:val="16"/>
-                <w:szCs w:val="16"/>
-              </w:rPr>
-              <w:t>pp. 7–13; Supplementary Tables S1–S2</w:t>
+                <w:rFonts w:ascii="Times New Roman" w:eastAsia="Times New Roman" w:hAnsi="Times New Roman" w:cs="Times New Roman"/>
+                <w:sz w:val="16"/>
+                <w:szCs w:val="16"/>
+              </w:rPr>
+              <w:t>pp. 7–14; Supplementary Tables S1–S2</w:t>
             </w:r>
           </w:p>
         </w:tc>
@@ -1731,11 +1588,11 @@
             </w:pPr>
             <w:r>
               <w:rPr>
-                <w:rFonts w:ascii="Times New Roman" w:hAnsi="Times New Roman" w:cs="Times New Roman"/>
-                <w:sz w:val="16"/>
-                <w:szCs w:val="16"/>
-              </w:rPr>
-              <w:t>pp. 7–13; Additional file 1</w:t>
+                <w:rFonts w:ascii="Times New Roman" w:eastAsia="Times New Roman" w:hAnsi="Times New Roman" w:cs="Times New Roman"/>
+                <w:sz w:val="16"/>
+                <w:szCs w:val="16"/>
+              </w:rPr>
+              <w:t>pp. 7–14; Additional file 1</w:t>
             </w:r>
           </w:p>
         </w:tc>
@@ -1834,29 +1691,11 @@
             </w:pPr>
             <w:r>
               <w:rPr>
-                <w:rFonts w:ascii="Times New Roman" w:hAnsi="Times New Roman" w:cs="Times New Roman"/>
-                <w:sz w:val="16"/>
-                <w:szCs w:val="16"/>
-              </w:rPr>
-              <w:t>No subgroup analysis was used for the primary conclusions. Prespecified direction/time-family cross-</w:t>
-            </w:r>
-            <w:proofErr w:type="spellStart"/>
-            <w:r>
-              <w:rPr>
-                <w:rFonts w:ascii="Times New Roman" w:hAnsi="Times New Roman" w:cs="Times New Roman"/>
-                <w:sz w:val="16"/>
-                <w:szCs w:val="16"/>
-              </w:rPr>
-              <w:t>omic</w:t>
-            </w:r>
-            <w:proofErr w:type="spellEnd"/>
-            <w:r>
-              <w:rPr>
-                <w:rFonts w:ascii="Times New Roman" w:hAnsi="Times New Roman" w:cs="Times New Roman"/>
-                <w:sz w:val="16"/>
-                <w:szCs w:val="16"/>
-              </w:rPr>
-              <w:t xml:space="preserve"> models are described on pp. 10–11 and in Additional file 1.</w:t>
+                <w:rFonts w:ascii="Times New Roman" w:eastAsia="Times New Roman" w:hAnsi="Times New Roman" w:cs="Times New Roman"/>
+                <w:sz w:val="16"/>
+                <w:szCs w:val="16"/>
+              </w:rPr>
+              <w:t>No subgroup analysis was used for the primary conclusions. Prespecified direction/time-family cross-omic models are described on pp. 10–12 and in Additional file 1.</w:t>
             </w:r>
           </w:p>
         </w:tc>
@@ -1955,11 +1794,11 @@
             </w:pPr>
             <w:r>
               <w:rPr>
-                <w:rFonts w:ascii="Times New Roman" w:hAnsi="Times New Roman" w:cs="Times New Roman"/>
-                <w:sz w:val="16"/>
-                <w:szCs w:val="16"/>
-              </w:rPr>
-              <w:t>p. 13; Supplementary Table S1; Additional file 1</w:t>
+                <w:rFonts w:ascii="Times New Roman" w:eastAsia="Times New Roman" w:hAnsi="Times New Roman" w:cs="Times New Roman"/>
+                <w:sz w:val="16"/>
+                <w:szCs w:val="16"/>
+              </w:rPr>
+              <w:t>p. 14; Supplementary Table S1; Additional file 1</w:t>
             </w:r>
           </w:p>
         </w:tc>
@@ -2058,11 +1897,11 @@
             </w:pPr>
             <w:r>
               <w:rPr>
-                <w:rFonts w:ascii="Times New Roman" w:hAnsi="Times New Roman" w:cs="Times New Roman"/>
-                <w:sz w:val="16"/>
-                <w:szCs w:val="16"/>
-              </w:rPr>
-              <w:t>p. 6 (60-day outcome follow-up with administrative censoring). Molecular sample non-observation was addressed separately in the Day-5 RNA-seq availability/IPW sensitivity analysis (pp. 12–13 and 24–25; Supplementary Table S8).</w:t>
+                <w:rFonts w:ascii="Times New Roman" w:eastAsia="Times New Roman" w:hAnsi="Times New Roman" w:cs="Times New Roman"/>
+                <w:sz w:val="16"/>
+                <w:szCs w:val="16"/>
+              </w:rPr>
+              <w:t>p. 6 (60-day outcome follow-up with administrative censoring). Molecular sample non-observation was addressed separately in the Day-5 RNA-seq availability/IPW sensitivity analysis (pp. 12–14 and 26–27; Supplementary Table S8).</w:t>
             </w:r>
           </w:p>
         </w:tc>
@@ -2161,11 +2000,11 @@
             </w:pPr>
             <w:r>
               <w:rPr>
-                <w:rFonts w:ascii="Times New Roman" w:hAnsi="Times New Roman" w:cs="Times New Roman"/>
-                <w:sz w:val="16"/>
-                <w:szCs w:val="16"/>
-              </w:rPr>
-              <w:t>pp. 9–13 and 24–25; Supplementary Tables S4, S6 and S8</w:t>
+                <w:rFonts w:ascii="Times New Roman" w:eastAsia="Times New Roman" w:hAnsi="Times New Roman" w:cs="Times New Roman"/>
+                <w:sz w:val="16"/>
+                <w:szCs w:val="16"/>
+              </w:rPr>
+              <w:t>pp. 9–14 and 18–27; Supplementary Tables S4, S6 and S8</w:t>
             </w:r>
           </w:p>
         </w:tc>
@@ -2282,11 +2121,11 @@
             </w:pPr>
             <w:r>
               <w:rPr>
-                <w:rFonts w:ascii="Times New Roman" w:hAnsi="Times New Roman" w:cs="Times New Roman"/>
-                <w:sz w:val="16"/>
-                <w:szCs w:val="16"/>
-              </w:rPr>
-              <w:t>The available secondary-analysis source cohort comprised 504 Day-1 SIC patients in CMAISE v1.5. The upstream parent-cohort screening cascade was not reconstructed from the controlled files available for this analysis. Figure 1 (pp. 14–15) reports the analytic source cohort, raw measured, risk-valid and positivity-supported analysis counts.</w:t>
+                <w:rFonts w:ascii="Times New Roman" w:eastAsia="Times New Roman" w:hAnsi="Times New Roman" w:cs="Times New Roman"/>
+                <w:sz w:val="16"/>
+                <w:szCs w:val="16"/>
+              </w:rPr>
+              <w:t>The available secondary-analysis source cohort comprised 504 Day-1 SIC patients in CMAISE v1.5. The upstream parent-cohort screening cascade was not reconstructed from the controlled files available for this analysis. Figure 1 (pp. 15–17) reports the analytic source cohort, raw measured, risk-valid and positivity-supported analysis counts.</w:t>
             </w:r>
           </w:p>
         </w:tc>
@@ -2385,29 +2224,11 @@
             </w:pPr>
             <w:r>
               <w:rPr>
-                <w:rFonts w:ascii="Times New Roman" w:hAnsi="Times New Roman" w:cs="Times New Roman"/>
-                <w:sz w:val="16"/>
-                <w:szCs w:val="16"/>
-              </w:rPr>
-              <w:t xml:space="preserve">pp. 14–15; Figure 1 (structural deaths, raw-to-risk-valid exclusions and patients from zero-observation </w:t>
-            </w:r>
-            <w:proofErr w:type="spellStart"/>
-            <w:r>
-              <w:rPr>
-                <w:rFonts w:ascii="Times New Roman" w:hAnsi="Times New Roman" w:cs="Times New Roman"/>
-                <w:sz w:val="16"/>
-                <w:szCs w:val="16"/>
-              </w:rPr>
-              <w:t>centres</w:t>
-            </w:r>
-            <w:proofErr w:type="spellEnd"/>
-            <w:r>
-              <w:rPr>
-                <w:rFonts w:ascii="Times New Roman" w:hAnsi="Times New Roman" w:cs="Times New Roman"/>
-                <w:sz w:val="16"/>
-                <w:szCs w:val="16"/>
-              </w:rPr>
-              <w:t>)</w:t>
+                <w:rFonts w:ascii="Times New Roman" w:eastAsia="Times New Roman" w:hAnsi="Times New Roman" w:cs="Times New Roman"/>
+                <w:sz w:val="16"/>
+                <w:szCs w:val="16"/>
+              </w:rPr>
+              <w:t>pp. 15–17; Figure 1 (structural deaths, raw-to-risk-valid exclusions and patients from zero-observation centres)</w:t>
             </w:r>
           </w:p>
         </w:tc>
@@ -2506,11 +2327,11 @@
             </w:pPr>
             <w:r>
               <w:rPr>
-                <w:rFonts w:ascii="Times New Roman" w:hAnsi="Times New Roman" w:cs="Times New Roman"/>
-                <w:sz w:val="16"/>
-                <w:szCs w:val="16"/>
-              </w:rPr>
-              <w:t>Figure 1, p. 15</w:t>
+                <w:rFonts w:ascii="Times New Roman" w:eastAsia="Times New Roman" w:hAnsi="Times New Roman" w:cs="Times New Roman"/>
+                <w:sz w:val="16"/>
+                <w:szCs w:val="16"/>
+              </w:rPr>
+              <w:t>Figure 1, p. 17</w:t>
             </w:r>
           </w:p>
         </w:tc>
@@ -2609,11 +2430,11 @@
             </w:pPr>
             <w:r>
               <w:rPr>
-                <w:rFonts w:ascii="Times New Roman" w:hAnsi="Times New Roman" w:cs="Times New Roman"/>
-                <w:sz w:val="16"/>
-                <w:szCs w:val="16"/>
-              </w:rPr>
-              <w:t>Table 1, pp. 40–41</w:t>
+                <w:rFonts w:ascii="Times New Roman" w:eastAsia="Times New Roman" w:hAnsi="Times New Roman" w:cs="Times New Roman"/>
+                <w:sz w:val="16"/>
+                <w:szCs w:val="16"/>
+              </w:rPr>
+              <w:t>Table 1, pp. 42–44</w:t>
             </w:r>
           </w:p>
         </w:tc>
@@ -2712,11 +2533,11 @@
             </w:pPr>
             <w:r>
               <w:rPr>
-                <w:rFonts w:ascii="Times New Roman" w:hAnsi="Times New Roman" w:cs="Times New Roman"/>
-                <w:sz w:val="16"/>
-                <w:szCs w:val="16"/>
-              </w:rPr>
-              <w:t>p. 13; Supplementary Table S1 (clinical-variable missingness/exclusion audit); Additional file 1; Supplementary Table S8 (Day-5 RNA-seq observation)</w:t>
+                <w:rFonts w:ascii="Times New Roman" w:eastAsia="Times New Roman" w:hAnsi="Times New Roman" w:cs="Times New Roman"/>
+                <w:sz w:val="16"/>
+                <w:szCs w:val="16"/>
+              </w:rPr>
+              <w:t>p. 14; Supplementary Table S1 (clinical-variable missingness/exclusion audit); Additional file 1; Supplementary Table S8 (Day-5 RNA-seq observation)</w:t>
             </w:r>
           </w:p>
         </w:tc>
@@ -2825,7 +2646,7 @@
             </w:pPr>
             <w:r>
               <w:rPr>
-                <w:rFonts w:ascii="Times New Roman" w:hAnsi="Times New Roman" w:cs="Times New Roman"/>
+                <w:rFonts w:ascii="Times New Roman" w:eastAsia="Times New Roman" w:hAnsi="Times New Roman" w:cs="Times New Roman"/>
                 <w:sz w:val="16"/>
                 <w:szCs w:val="16"/>
               </w:rPr>
@@ -2928,11 +2749,11 @@
             </w:pPr>
             <w:r>
               <w:rPr>
-                <w:rFonts w:ascii="Times New Roman" w:hAnsi="Times New Roman" w:cs="Times New Roman"/>
-                <w:sz w:val="16"/>
-                <w:szCs w:val="16"/>
-              </w:rPr>
-              <w:t>pp. 14–15; Figure 1</w:t>
+                <w:rFonts w:ascii="Times New Roman" w:eastAsia="Times New Roman" w:hAnsi="Times New Roman" w:cs="Times New Roman"/>
+                <w:sz w:val="16"/>
+                <w:szCs w:val="16"/>
+              </w:rPr>
+              <w:t>pp. 15–17; Figure 1</w:t>
             </w:r>
           </w:p>
         </w:tc>
@@ -3031,11 +2852,11 @@
             </w:pPr>
             <w:r>
               <w:rPr>
-                <w:rFonts w:ascii="Times New Roman" w:hAnsi="Times New Roman" w:cs="Times New Roman"/>
-                <w:sz w:val="16"/>
-                <w:szCs w:val="16"/>
-              </w:rPr>
-              <w:t>pp. 16–25; Figures 2–4; Supplementary Tables S2–S7</w:t>
+                <w:rFonts w:ascii="Times New Roman" w:eastAsia="Times New Roman" w:hAnsi="Times New Roman" w:cs="Times New Roman"/>
+                <w:sz w:val="16"/>
+                <w:szCs w:val="16"/>
+              </w:rPr>
+              <w:t>pp. 16–27; Figures 2–4; Supplementary Tables S2–S7</w:t>
             </w:r>
           </w:p>
         </w:tc>
@@ -3152,29 +2973,11 @@
             </w:pPr>
             <w:r>
               <w:rPr>
-                <w:rFonts w:ascii="Times New Roman" w:hAnsi="Times New Roman" w:cs="Times New Roman"/>
-                <w:sz w:val="16"/>
-                <w:szCs w:val="16"/>
-              </w:rPr>
-              <w:t xml:space="preserve">Not applicable to the primary molecular analyses; continuous molecular features were </w:t>
-            </w:r>
-            <w:proofErr w:type="spellStart"/>
-            <w:r>
-              <w:rPr>
-                <w:rFonts w:ascii="Times New Roman" w:hAnsi="Times New Roman" w:cs="Times New Roman"/>
-                <w:sz w:val="16"/>
-                <w:szCs w:val="16"/>
-              </w:rPr>
-              <w:t>standardised</w:t>
-            </w:r>
-            <w:proofErr w:type="spellEnd"/>
-            <w:r>
-              <w:rPr>
-                <w:rFonts w:ascii="Times New Roman" w:hAnsi="Times New Roman" w:cs="Times New Roman"/>
-                <w:sz w:val="16"/>
-                <w:szCs w:val="16"/>
-              </w:rPr>
-              <w:t xml:space="preserve"> and clinical Cox contrasts used prespecified increments (pp. 7 and 9; Supplementary Table S2).</w:t>
+                <w:rFonts w:ascii="Times New Roman" w:eastAsia="Times New Roman" w:hAnsi="Times New Roman" w:cs="Times New Roman"/>
+                <w:sz w:val="16"/>
+                <w:szCs w:val="16"/>
+              </w:rPr>
+              <w:t>Not applicable to the primary molecular analyses; continuous molecular features were standardised and clinical Cox contrasts used prespecified increments (pp. 7 and 9; Supplementary Table S2).</w:t>
             </w:r>
           </w:p>
         </w:tc>
@@ -3273,29 +3076,11 @@
             </w:pPr>
             <w:r>
               <w:rPr>
-                <w:rFonts w:ascii="Times New Roman" w:hAnsi="Times New Roman" w:cs="Times New Roman"/>
-                <w:sz w:val="16"/>
-                <w:szCs w:val="16"/>
-              </w:rPr>
-              <w:t xml:space="preserve">Not applicable: the study </w:t>
-            </w:r>
-            <w:proofErr w:type="spellStart"/>
-            <w:r>
-              <w:rPr>
-                <w:rFonts w:ascii="Times New Roman" w:hAnsi="Times New Roman" w:cs="Times New Roman"/>
-                <w:sz w:val="16"/>
-                <w:szCs w:val="16"/>
-              </w:rPr>
-              <w:t>characterised</w:t>
-            </w:r>
-            <w:proofErr w:type="spellEnd"/>
-            <w:r>
-              <w:rPr>
-                <w:rFonts w:ascii="Times New Roman" w:hAnsi="Times New Roman" w:cs="Times New Roman"/>
-                <w:sz w:val="16"/>
-                <w:szCs w:val="16"/>
-              </w:rPr>
-              <w:t xml:space="preserve"> prognostic molecular associations rather than developing an absolute-risk model.</w:t>
+                <w:rFonts w:ascii="Times New Roman" w:eastAsia="Times New Roman" w:hAnsi="Times New Roman" w:cs="Times New Roman"/>
+                <w:sz w:val="16"/>
+                <w:szCs w:val="16"/>
+              </w:rPr>
+              <w:t>Not applicable: the study characterised prognostic molecular associations rather than developing an absolute-risk model.</w:t>
             </w:r>
           </w:p>
         </w:tc>
@@ -3395,11 +3180,11 @@
             </w:pPr>
             <w:r>
               <w:rPr>
-                <w:rFonts w:ascii="Times New Roman" w:hAnsi="Times New Roman" w:cs="Times New Roman"/>
-                <w:sz w:val="16"/>
-                <w:szCs w:val="16"/>
-              </w:rPr>
-              <w:t>pp. 24–25; Supplementary Table S8; Supplementary Figures A1–A9</w:t>
+                <w:rFonts w:ascii="Times New Roman" w:eastAsia="Times New Roman" w:hAnsi="Times New Roman" w:cs="Times New Roman"/>
+                <w:sz w:val="16"/>
+                <w:szCs w:val="16"/>
+              </w:rPr>
+              <w:t>pp. 18–27; Supplementary Tables S4, S6 and S8; Supplementary Figures A1–A9</w:t>
             </w:r>
           </w:p>
         </w:tc>
@@ -3508,11 +3293,11 @@
             </w:pPr>
             <w:r>
               <w:rPr>
-                <w:rFonts w:ascii="Times New Roman" w:hAnsi="Times New Roman" w:cs="Times New Roman"/>
-                <w:sz w:val="16"/>
-                <w:szCs w:val="16"/>
-              </w:rPr>
-              <w:t>pp. 25–26 (Principal findings)</w:t>
+                <w:rFonts w:ascii="Times New Roman" w:eastAsia="Times New Roman" w:hAnsi="Times New Roman" w:cs="Times New Roman"/>
+                <w:sz w:val="16"/>
+                <w:szCs w:val="16"/>
+              </w:rPr>
+              <w:t>pp. 27–28 (Principal findings)</w:t>
             </w:r>
           </w:p>
         </w:tc>
@@ -3611,11 +3396,11 @@
             </w:pPr>
             <w:r>
               <w:rPr>
-                <w:rFonts w:ascii="Times New Roman" w:hAnsi="Times New Roman" w:cs="Times New Roman"/>
-                <w:sz w:val="16"/>
-                <w:szCs w:val="16"/>
-              </w:rPr>
-              <w:t>pp. 35–37 (Strengths and limitations)</w:t>
+                <w:rFonts w:ascii="Times New Roman" w:eastAsia="Times New Roman" w:hAnsi="Times New Roman" w:cs="Times New Roman"/>
+                <w:sz w:val="16"/>
+                <w:szCs w:val="16"/>
+              </w:rPr>
+              <w:t>pp. 37–39 (Strengths and limitations)</w:t>
             </w:r>
           </w:p>
         </w:tc>
@@ -3714,11 +3499,11 @@
             </w:pPr>
             <w:r>
               <w:rPr>
-                <w:rFonts w:ascii="Times New Roman" w:hAnsi="Times New Roman" w:cs="Times New Roman"/>
-                <w:sz w:val="16"/>
-                <w:szCs w:val="16"/>
-              </w:rPr>
-              <w:t>pp. 25–37 (Discussion)</w:t>
+                <w:rFonts w:ascii="Times New Roman" w:eastAsia="Times New Roman" w:hAnsi="Times New Roman" w:cs="Times New Roman"/>
+                <w:sz w:val="16"/>
+                <w:szCs w:val="16"/>
+              </w:rPr>
+              <w:t>pp. 27–39 (Discussion)</w:t>
             </w:r>
           </w:p>
         </w:tc>
@@ -3837,11 +3622,11 @@
             </w:pPr>
             <w:r>
               <w:rPr>
-                <w:rFonts w:ascii="Times New Roman" w:hAnsi="Times New Roman" w:cs="Times New Roman"/>
-                <w:sz w:val="16"/>
-                <w:szCs w:val="16"/>
-              </w:rPr>
-              <w:t>pp. 35–37 (external validation, cohort and assay limitations)</w:t>
+                <w:rFonts w:ascii="Times New Roman" w:eastAsia="Times New Roman" w:hAnsi="Times New Roman" w:cs="Times New Roman"/>
+                <w:sz w:val="16"/>
+                <w:szCs w:val="16"/>
+              </w:rPr>
+              <w:t>pp. 36–39 (external validation, cohort and assay limitations)</w:t>
             </w:r>
           </w:p>
         </w:tc>
@@ -3940,11 +3725,11 @@
             </w:pPr>
             <w:r>
               <w:rPr>
-                <w:rFonts w:ascii="Times New Roman" w:hAnsi="Times New Roman" w:cs="Times New Roman"/>
-                <w:sz w:val="16"/>
-                <w:szCs w:val="16"/>
-              </w:rPr>
-              <w:t>p. 39 (Funding)</w:t>
+                <w:rFonts w:ascii="Times New Roman" w:eastAsia="Times New Roman" w:hAnsi="Times New Roman" w:cs="Times New Roman"/>
+                <w:sz w:val="16"/>
+                <w:szCs w:val="16"/>
+              </w:rPr>
+              <w:t>p. 41 (Funding)</w:t>
             </w:r>
           </w:p>
         </w:tc>

</xml_diff>

<commit_message>
Freeze Journal of Intensive Care submission release v1.0 (#2)
</commit_message>
<xml_diff>
--- a/submission/manuscript_files/STROBE_checklist_cohort_completed.docx
+++ b/submission/manuscript_files/STROBE_checklist_cohort_completed.docx
@@ -29,77 +29,10 @@
       </w:pPr>
       <w:r>
         <w:rPr>
-          <w:rFonts w:ascii="Times New Roman" w:hAnsi="Times New Roman" w:cs="Times New Roman"/>
+          <w:rFonts w:ascii="Times New Roman" w:eastAsia="Times New Roman" w:hAnsi="Times New Roman"/>
           <w:sz w:val="16"/>
-          <w:szCs w:val="16"/>
         </w:rPr>
-        <w:t xml:space="preserve">Manuscript: Landmark-specific transcriptomic and proteomic </w:t>
-      </w:r>
-      <w:r>
-        <w:rPr>
-          <w:rFonts w:ascii="Times New Roman" w:hAnsi="Times New Roman" w:cs="Times New Roman" w:hint="eastAsia"/>
-          <w:sz w:val="16"/>
-          <w:szCs w:val="16"/>
-        </w:rPr>
-        <w:t>associations</w:t>
-      </w:r>
-      <w:r>
-        <w:rPr>
-          <w:rFonts w:ascii="Times New Roman" w:hAnsi="Times New Roman" w:cs="Times New Roman"/>
-          <w:sz w:val="16"/>
-          <w:szCs w:val="16"/>
-        </w:rPr>
-        <w:t xml:space="preserve"> with </w:t>
-      </w:r>
-      <w:r>
-        <w:rPr>
-          <w:rFonts w:ascii="Times New Roman" w:hAnsi="Times New Roman" w:cs="Times New Roman" w:hint="eastAsia"/>
-          <w:sz w:val="16"/>
-          <w:szCs w:val="16"/>
-        </w:rPr>
-        <w:t xml:space="preserve">60-day </w:t>
-      </w:r>
-      <w:r>
-        <w:rPr>
-          <w:rFonts w:ascii="Times New Roman" w:hAnsi="Times New Roman" w:cs="Times New Roman"/>
-          <w:sz w:val="16"/>
-          <w:szCs w:val="16"/>
-        </w:rPr>
-        <w:t xml:space="preserve">mortality in </w:t>
-      </w:r>
-      <w:r>
-        <w:rPr>
-          <w:rFonts w:ascii="Times New Roman" w:hAnsi="Times New Roman" w:cs="Times New Roman" w:hint="eastAsia"/>
-          <w:sz w:val="16"/>
-          <w:szCs w:val="16"/>
-        </w:rPr>
-        <w:t>D</w:t>
-      </w:r>
-      <w:r>
-        <w:rPr>
-          <w:rFonts w:ascii="Times New Roman" w:hAnsi="Times New Roman" w:cs="Times New Roman"/>
-          <w:sz w:val="16"/>
-          <w:szCs w:val="16"/>
-        </w:rPr>
-        <w:t xml:space="preserve">ay-1-defined sepsis-induced coagulopathy: a </w:t>
-      </w:r>
-      <w:proofErr w:type="spellStart"/>
-      <w:r>
-        <w:rPr>
-          <w:rFonts w:ascii="Times New Roman" w:hAnsi="Times New Roman" w:cs="Times New Roman"/>
-          <w:sz w:val="16"/>
-          <w:szCs w:val="16"/>
-        </w:rPr>
-        <w:t>multicentre</w:t>
-      </w:r>
-      <w:proofErr w:type="spellEnd"/>
-      <w:r>
-        <w:rPr>
-          <w:rFonts w:ascii="Times New Roman" w:hAnsi="Times New Roman" w:cs="Times New Roman"/>
-          <w:sz w:val="16"/>
-          <w:szCs w:val="16"/>
-        </w:rPr>
-        <w:t xml:space="preserve"> longitudinal cohort study</w:t>
+        <w:t>Manuscript: Landmark-specific transcriptomic and proteomic associations with 60-day mortality in Day-1-defined sepsis-induced coagulopathy: a multicentre longitudinal cohort study</w:t>
       </w:r>
     </w:p>
     <w:p>
@@ -113,28 +46,10 @@
       </w:pPr>
       <w:r>
         <w:rPr>
-          <w:rFonts w:ascii="Times New Roman" w:hAnsi="Times New Roman" w:cs="Times New Roman"/>
+          <w:rFonts w:ascii="Times New Roman" w:eastAsia="Times New Roman" w:hAnsi="Times New Roman"/>
           <w:sz w:val="16"/>
-          <w:szCs w:val="16"/>
         </w:rPr>
-        <w:t>Reporting guideline: STROBE cohort checklist (https://www.strobe-statement.org/checklists/; accessed 2</w:t>
-      </w:r>
-      <w:r>
-        <w:rPr>
-          <w:rFonts w:ascii="Times New Roman" w:eastAsia="宋体" w:hAnsi="Times New Roman" w:cs="Times New Roman" w:hint="eastAsia"/>
-          <w:sz w:val="16"/>
-          <w:szCs w:val="16"/>
-          <w:lang w:eastAsia="zh-CN"/>
-        </w:rPr>
-        <w:t>1</w:t>
-      </w:r>
-      <w:r>
-        <w:rPr>
-          <w:rFonts w:ascii="Times New Roman" w:hAnsi="Times New Roman" w:cs="Times New Roman"/>
-          <w:sz w:val="16"/>
-          <w:szCs w:val="16"/>
-        </w:rPr>
-        <w:t xml:space="preserve"> July 2026). Page numbers refer to the clean Journal of Intensive Care manuscript supplied with this checklist. Additional file 1 contains Supplementary Methods and Figures; Additional file 2 contains Supplementary Tables S1–S8.</w:t>
+        <w:t>Reporting guideline: STROBE cohort checklist (https://www.strobe-statement.org/checklists/; accessed 22 July 2026). Page numbers refer to JIC_722_final_manuscript.docx. Additional file 1 contains Supplementary Methods and Figures; Additional file 2 contains Supplementary Tables S1–S8.</w:t>
       </w:r>
     </w:p>
     <w:tbl>
@@ -158,7 +73,6 @@
         <w:tc>
           <w:tcPr>
             <w:tcW w:w="2041" w:type="dxa"/>
-            <w:shd w:val="clear" w:color="auto" w:fill="D9EAF7"/>
             <w:vAlign w:val="center"/>
           </w:tcPr>
           <w:p>
@@ -180,7 +94,6 @@
         <w:tc>
           <w:tcPr>
             <w:tcW w:w="850" w:type="dxa"/>
-            <w:shd w:val="clear" w:color="auto" w:fill="D9EAF7"/>
             <w:vAlign w:val="center"/>
           </w:tcPr>
           <w:p>
@@ -202,7 +115,6 @@
         <w:tc>
           <w:tcPr>
             <w:tcW w:w="5669" w:type="dxa"/>
-            <w:shd w:val="clear" w:color="auto" w:fill="D9EAF7"/>
             <w:vAlign w:val="center"/>
           </w:tcPr>
           <w:p>
@@ -224,7 +136,6 @@
         <w:tc>
           <w:tcPr>
             <w:tcW w:w="6236" w:type="dxa"/>
-            <w:shd w:val="clear" w:color="auto" w:fill="D9EAF7"/>
             <w:vAlign w:val="center"/>
           </w:tcPr>
           <w:p>
@@ -338,29 +249,11 @@
             </w:pPr>
             <w:r>
               <w:rPr>
-                <w:rFonts w:ascii="Times New Roman" w:hAnsi="Times New Roman" w:cs="Times New Roman"/>
-                <w:sz w:val="16"/>
-                <w:szCs w:val="16"/>
-              </w:rPr>
-              <w:t xml:space="preserve">p. 1 (title: </w:t>
-            </w:r>
-            <w:proofErr w:type="spellStart"/>
-            <w:r>
-              <w:rPr>
-                <w:rFonts w:ascii="Times New Roman" w:hAnsi="Times New Roman" w:cs="Times New Roman"/>
-                <w:sz w:val="16"/>
-                <w:szCs w:val="16"/>
-              </w:rPr>
-              <w:t>multicentre</w:t>
-            </w:r>
-            <w:proofErr w:type="spellEnd"/>
-            <w:r>
-              <w:rPr>
-                <w:rFonts w:ascii="Times New Roman" w:hAnsi="Times New Roman" w:cs="Times New Roman"/>
-                <w:sz w:val="16"/>
-                <w:szCs w:val="16"/>
-              </w:rPr>
-              <w:t xml:space="preserve"> longitudinal cohort study)</w:t>
+                <w:rFonts w:ascii="Times New Roman" w:eastAsia="Times New Roman" w:hAnsi="Times New Roman" w:cs="Times New Roman"/>
+                <w:sz w:val="16"/>
+                <w:szCs w:val="16"/>
+              </w:rPr>
+              <w:t>p. 1 (title: multicentre longitudinal cohort study)</w:t>
             </w:r>
           </w:p>
         </w:tc>
@@ -459,7 +352,7 @@
             </w:pPr>
             <w:r>
               <w:rPr>
-                <w:rFonts w:ascii="Times New Roman" w:hAnsi="Times New Roman" w:cs="Times New Roman"/>
+                <w:rFonts w:ascii="Times New Roman" w:eastAsia="Times New Roman" w:hAnsi="Times New Roman" w:cs="Times New Roman"/>
                 <w:sz w:val="16"/>
                 <w:szCs w:val="16"/>
               </w:rPr>
@@ -562,7 +455,7 @@
             </w:pPr>
             <w:r>
               <w:rPr>
-                <w:rFonts w:ascii="Times New Roman" w:hAnsi="Times New Roman" w:cs="Times New Roman"/>
+                <w:rFonts w:ascii="Times New Roman" w:eastAsia="Times New Roman" w:hAnsi="Times New Roman" w:cs="Times New Roman"/>
                 <w:sz w:val="16"/>
                 <w:szCs w:val="16"/>
               </w:rPr>
@@ -665,7 +558,7 @@
             </w:pPr>
             <w:r>
               <w:rPr>
-                <w:rFonts w:ascii="Times New Roman" w:hAnsi="Times New Roman" w:cs="Times New Roman"/>
+                <w:rFonts w:ascii="Times New Roman" w:eastAsia="Times New Roman" w:hAnsi="Times New Roman" w:cs="Times New Roman"/>
                 <w:sz w:val="16"/>
                 <w:szCs w:val="16"/>
               </w:rPr>
@@ -768,29 +661,11 @@
             </w:pPr>
             <w:r>
               <w:rPr>
-                <w:rFonts w:ascii="Times New Roman" w:hAnsi="Times New Roman" w:cs="Times New Roman"/>
-                <w:sz w:val="16"/>
-                <w:szCs w:val="16"/>
-              </w:rPr>
-              <w:t xml:space="preserve">pp. 5–6 (Study design and data source; Analytic framework and </w:t>
-            </w:r>
-            <w:proofErr w:type="spellStart"/>
-            <w:r>
-              <w:rPr>
-                <w:rFonts w:ascii="Times New Roman" w:hAnsi="Times New Roman" w:cs="Times New Roman"/>
-                <w:sz w:val="16"/>
-                <w:szCs w:val="16"/>
-              </w:rPr>
-              <w:t>estimands</w:t>
-            </w:r>
-            <w:proofErr w:type="spellEnd"/>
-            <w:r>
-              <w:rPr>
-                <w:rFonts w:ascii="Times New Roman" w:hAnsi="Times New Roman" w:cs="Times New Roman"/>
-                <w:sz w:val="16"/>
-                <w:szCs w:val="16"/>
-              </w:rPr>
-              <w:t>)</w:t>
+                <w:rFonts w:ascii="Times New Roman" w:eastAsia="Times New Roman" w:hAnsi="Times New Roman" w:cs="Times New Roman"/>
+                <w:sz w:val="16"/>
+                <w:szCs w:val="16"/>
+              </w:rPr>
+              <w:t>pp. 5–6 (Study design and data source; Analytic framework and estimands)</w:t>
             </w:r>
           </w:p>
         </w:tc>
@@ -889,11 +764,11 @@
             </w:pPr>
             <w:r>
               <w:rPr>
-                <w:rFonts w:ascii="Times New Roman" w:hAnsi="Times New Roman" w:cs="Times New Roman"/>
-                <w:sz w:val="16"/>
-                <w:szCs w:val="16"/>
-              </w:rPr>
-              <w:t>pp. 5–8 (43 tertiary hospitals; November 2020–November 2024; 60-day follow-up; molecular sampling)</w:t>
+                <w:rFonts w:ascii="Times New Roman" w:eastAsia="Times New Roman" w:hAnsi="Times New Roman" w:cs="Times New Roman"/>
+                <w:sz w:val="16"/>
+                <w:szCs w:val="16"/>
+              </w:rPr>
+              <w:t>pp. 5–8 (43 tertiary hospitals; November 2020–November 2024; 60-day follow-up; Days 1, 3 and 5 molecular sampling)</w:t>
             </w:r>
           </w:p>
         </w:tc>
@@ -992,11 +867,11 @@
             </w:pPr>
             <w:r>
               <w:rPr>
-                <w:rFonts w:ascii="Times New Roman" w:hAnsi="Times New Roman" w:cs="Times New Roman"/>
-                <w:sz w:val="16"/>
-                <w:szCs w:val="16"/>
-              </w:rPr>
-              <w:t>pp. 6–7 and 14–15; Figure 1</w:t>
+                <w:rFonts w:ascii="Times New Roman" w:eastAsia="Times New Roman" w:hAnsi="Times New Roman" w:cs="Times New Roman"/>
+                <w:sz w:val="16"/>
+                <w:szCs w:val="16"/>
+              </w:rPr>
+              <w:t>pp. 6–7 and 15–17; Figure 1</w:t>
             </w:r>
           </w:p>
         </w:tc>
@@ -1095,7 +970,7 @@
             </w:pPr>
             <w:r>
               <w:rPr>
-                <w:rFonts w:ascii="Times New Roman" w:hAnsi="Times New Roman" w:cs="Times New Roman"/>
+                <w:rFonts w:ascii="Times New Roman" w:eastAsia="Times New Roman" w:hAnsi="Times New Roman" w:cs="Times New Roman"/>
                 <w:sz w:val="16"/>
                 <w:szCs w:val="16"/>
               </w:rPr>
@@ -1198,11 +1073,11 @@
             </w:pPr>
             <w:r>
               <w:rPr>
-                <w:rFonts w:ascii="Times New Roman" w:hAnsi="Times New Roman" w:cs="Times New Roman"/>
-                <w:sz w:val="16"/>
-                <w:szCs w:val="16"/>
-              </w:rPr>
-              <w:t>pp. 6–13; Supplementary Table S1</w:t>
+                <w:rFonts w:ascii="Times New Roman" w:eastAsia="Times New Roman" w:hAnsi="Times New Roman" w:cs="Times New Roman"/>
+                <w:sz w:val="16"/>
+                <w:szCs w:val="16"/>
+              </w:rPr>
+              <w:t>pp. 6–14; Supplementary Table S1</w:t>
             </w:r>
           </w:p>
         </w:tc>
@@ -1301,11 +1176,11 @@
             </w:pPr>
             <w:r>
               <w:rPr>
-                <w:rFonts w:ascii="Times New Roman" w:hAnsi="Times New Roman" w:cs="Times New Roman"/>
-                <w:sz w:val="16"/>
-                <w:szCs w:val="16"/>
-              </w:rPr>
-              <w:t>pp. 7–8; Additional file 1 (Supplementary Methods)</w:t>
+                <w:rFonts w:ascii="Times New Roman" w:eastAsia="Times New Roman" w:hAnsi="Times New Roman" w:cs="Times New Roman"/>
+                <w:sz w:val="16"/>
+                <w:szCs w:val="16"/>
+              </w:rPr>
+              <w:t>pp. 7–9; Additional file 1 (Supplementary Methods)</w:t>
             </w:r>
           </w:p>
         </w:tc>
@@ -1404,29 +1279,11 @@
             </w:pPr>
             <w:r>
               <w:rPr>
-                <w:rFonts w:ascii="Times New Roman" w:hAnsi="Times New Roman" w:cs="Times New Roman"/>
-                <w:sz w:val="16"/>
-                <w:szCs w:val="16"/>
-              </w:rPr>
-              <w:t xml:space="preserve">pp. 6–13 (delayed entry, </w:t>
-            </w:r>
-            <w:proofErr w:type="spellStart"/>
-            <w:r>
-              <w:rPr>
-                <w:rFonts w:ascii="Times New Roman" w:hAnsi="Times New Roman" w:cs="Times New Roman"/>
-                <w:sz w:val="16"/>
-                <w:szCs w:val="16"/>
-              </w:rPr>
-              <w:t>centre</w:t>
-            </w:r>
-            <w:proofErr w:type="spellEnd"/>
-            <w:r>
-              <w:rPr>
-                <w:rFonts w:ascii="Times New Roman" w:hAnsi="Times New Roman" w:cs="Times New Roman"/>
-                <w:sz w:val="16"/>
-                <w:szCs w:val="16"/>
-              </w:rPr>
-              <w:t xml:space="preserve"> stratification, PH and intensity sensitivity analyses, and availability/IPW); pp. 33–34</w:t>
+                <w:rFonts w:ascii="Times New Roman" w:eastAsia="Times New Roman" w:hAnsi="Times New Roman" w:cs="Times New Roman"/>
+                <w:sz w:val="16"/>
+                <w:szCs w:val="16"/>
+              </w:rPr>
+              <w:t>pp. 6–14 (delayed entry, centre stratification, PH and intensity sensitivity analyses, and Day-5 availability/IPW); pp. 35–39</w:t>
             </w:r>
           </w:p>
         </w:tc>
@@ -1525,11 +1382,11 @@
             </w:pPr>
             <w:r>
               <w:rPr>
-                <w:rFonts w:ascii="Times New Roman" w:hAnsi="Times New Roman" w:cs="Times New Roman"/>
-                <w:sz w:val="16"/>
-                <w:szCs w:val="16"/>
-              </w:rPr>
-              <w:t>p. 6 (all patients in the available Day-1 SIC analytic source cohort and all available molecular measurements; no prospective sample-size calculation)</w:t>
+                <w:rFonts w:ascii="Times New Roman" w:eastAsia="Times New Roman" w:hAnsi="Times New Roman" w:cs="Times New Roman"/>
+                <w:sz w:val="16"/>
+                <w:szCs w:val="16"/>
+              </w:rPr>
+              <w:t>p. 6 (all eligible patients and available molecular measurements were included; no prospective sample-size calculation)</w:t>
             </w:r>
           </w:p>
         </w:tc>
@@ -1628,11 +1485,11 @@
             </w:pPr>
             <w:r>
               <w:rPr>
-                <w:rFonts w:ascii="Times New Roman" w:hAnsi="Times New Roman" w:cs="Times New Roman"/>
-                <w:sz w:val="16"/>
-                <w:szCs w:val="16"/>
-              </w:rPr>
-              <w:t>pp. 7–13; Supplementary Tables S1–S2</w:t>
+                <w:rFonts w:ascii="Times New Roman" w:eastAsia="Times New Roman" w:hAnsi="Times New Roman" w:cs="Times New Roman"/>
+                <w:sz w:val="16"/>
+                <w:szCs w:val="16"/>
+              </w:rPr>
+              <w:t>pp. 7–14; Supplementary Tables S1–S2</w:t>
             </w:r>
           </w:p>
         </w:tc>
@@ -1731,11 +1588,11 @@
             </w:pPr>
             <w:r>
               <w:rPr>
-                <w:rFonts w:ascii="Times New Roman" w:hAnsi="Times New Roman" w:cs="Times New Roman"/>
-                <w:sz w:val="16"/>
-                <w:szCs w:val="16"/>
-              </w:rPr>
-              <w:t>pp. 7–13; Additional file 1</w:t>
+                <w:rFonts w:ascii="Times New Roman" w:eastAsia="Times New Roman" w:hAnsi="Times New Roman" w:cs="Times New Roman"/>
+                <w:sz w:val="16"/>
+                <w:szCs w:val="16"/>
+              </w:rPr>
+              <w:t>pp. 7–14; Additional file 1</w:t>
             </w:r>
           </w:p>
         </w:tc>
@@ -1834,29 +1691,11 @@
             </w:pPr>
             <w:r>
               <w:rPr>
-                <w:rFonts w:ascii="Times New Roman" w:hAnsi="Times New Roman" w:cs="Times New Roman"/>
-                <w:sz w:val="16"/>
-                <w:szCs w:val="16"/>
-              </w:rPr>
-              <w:t>No subgroup analysis was used for the primary conclusions. Prespecified direction/time-family cross-</w:t>
-            </w:r>
-            <w:proofErr w:type="spellStart"/>
-            <w:r>
-              <w:rPr>
-                <w:rFonts w:ascii="Times New Roman" w:hAnsi="Times New Roman" w:cs="Times New Roman"/>
-                <w:sz w:val="16"/>
-                <w:szCs w:val="16"/>
-              </w:rPr>
-              <w:t>omic</w:t>
-            </w:r>
-            <w:proofErr w:type="spellEnd"/>
-            <w:r>
-              <w:rPr>
-                <w:rFonts w:ascii="Times New Roman" w:hAnsi="Times New Roman" w:cs="Times New Roman"/>
-                <w:sz w:val="16"/>
-                <w:szCs w:val="16"/>
-              </w:rPr>
-              <w:t xml:space="preserve"> models are described on pp. 10–11 and in Additional file 1.</w:t>
+                <w:rFonts w:ascii="Times New Roman" w:eastAsia="Times New Roman" w:hAnsi="Times New Roman" w:cs="Times New Roman"/>
+                <w:sz w:val="16"/>
+                <w:szCs w:val="16"/>
+              </w:rPr>
+              <w:t>No subgroup analysis was used for the primary conclusions. Prespecified direction/time-family cross-omic models are described on pp. 10–12 and in Additional file 1.</w:t>
             </w:r>
           </w:p>
         </w:tc>
@@ -1955,11 +1794,11 @@
             </w:pPr>
             <w:r>
               <w:rPr>
-                <w:rFonts w:ascii="Times New Roman" w:hAnsi="Times New Roman" w:cs="Times New Roman"/>
-                <w:sz w:val="16"/>
-                <w:szCs w:val="16"/>
-              </w:rPr>
-              <w:t>p. 13; Supplementary Table S1; Additional file 1</w:t>
+                <w:rFonts w:ascii="Times New Roman" w:eastAsia="Times New Roman" w:hAnsi="Times New Roman" w:cs="Times New Roman"/>
+                <w:sz w:val="16"/>
+                <w:szCs w:val="16"/>
+              </w:rPr>
+              <w:t>p. 14; Supplementary Table S1; Additional file 1</w:t>
             </w:r>
           </w:p>
         </w:tc>
@@ -2058,11 +1897,11 @@
             </w:pPr>
             <w:r>
               <w:rPr>
-                <w:rFonts w:ascii="Times New Roman" w:hAnsi="Times New Roman" w:cs="Times New Roman"/>
-                <w:sz w:val="16"/>
-                <w:szCs w:val="16"/>
-              </w:rPr>
-              <w:t>p. 6 (60-day outcome follow-up with administrative censoring). Molecular sample non-observation was addressed separately in the Day-5 RNA-seq availability/IPW sensitivity analysis (pp. 12–13 and 24–25; Supplementary Table S8).</w:t>
+                <w:rFonts w:ascii="Times New Roman" w:eastAsia="Times New Roman" w:hAnsi="Times New Roman" w:cs="Times New Roman"/>
+                <w:sz w:val="16"/>
+                <w:szCs w:val="16"/>
+              </w:rPr>
+              <w:t>p. 6 (60-day outcome follow-up with administrative censoring). Molecular sample non-observation was addressed separately in the Day-5 RNA-seq availability/IPW sensitivity analysis (pp. 12–14 and 26–27; Supplementary Table S8).</w:t>
             </w:r>
           </w:p>
         </w:tc>
@@ -2161,11 +2000,11 @@
             </w:pPr>
             <w:r>
               <w:rPr>
-                <w:rFonts w:ascii="Times New Roman" w:hAnsi="Times New Roman" w:cs="Times New Roman"/>
-                <w:sz w:val="16"/>
-                <w:szCs w:val="16"/>
-              </w:rPr>
-              <w:t>pp. 9–13 and 24–25; Supplementary Tables S4, S6 and S8</w:t>
+                <w:rFonts w:ascii="Times New Roman" w:eastAsia="Times New Roman" w:hAnsi="Times New Roman" w:cs="Times New Roman"/>
+                <w:sz w:val="16"/>
+                <w:szCs w:val="16"/>
+              </w:rPr>
+              <w:t>pp. 9–14 and 18–27; Supplementary Tables S4, S6 and S8</w:t>
             </w:r>
           </w:p>
         </w:tc>
@@ -2282,11 +2121,11 @@
             </w:pPr>
             <w:r>
               <w:rPr>
-                <w:rFonts w:ascii="Times New Roman" w:hAnsi="Times New Roman" w:cs="Times New Roman"/>
-                <w:sz w:val="16"/>
-                <w:szCs w:val="16"/>
-              </w:rPr>
-              <w:t>The available secondary-analysis source cohort comprised 504 Day-1 SIC patients in CMAISE v1.5. The upstream parent-cohort screening cascade was not reconstructed from the controlled files available for this analysis. Figure 1 (pp. 14–15) reports the analytic source cohort, raw measured, risk-valid and positivity-supported analysis counts.</w:t>
+                <w:rFonts w:ascii="Times New Roman" w:eastAsia="Times New Roman" w:hAnsi="Times New Roman" w:cs="Times New Roman"/>
+                <w:sz w:val="16"/>
+                <w:szCs w:val="16"/>
+              </w:rPr>
+              <w:t>The available secondary-analysis source cohort comprised 504 Day-1 SIC patients in CMAISE v1.5. The upstream parent-cohort screening cascade was not reconstructed from the controlled files available for this analysis. Figure 1 (pp. 15–17) reports the analytic source cohort, raw measured, risk-valid and positivity-supported analysis counts.</w:t>
             </w:r>
           </w:p>
         </w:tc>
@@ -2385,29 +2224,11 @@
             </w:pPr>
             <w:r>
               <w:rPr>
-                <w:rFonts w:ascii="Times New Roman" w:hAnsi="Times New Roman" w:cs="Times New Roman"/>
-                <w:sz w:val="16"/>
-                <w:szCs w:val="16"/>
-              </w:rPr>
-              <w:t xml:space="preserve">pp. 14–15; Figure 1 (structural deaths, raw-to-risk-valid exclusions and patients from zero-observation </w:t>
-            </w:r>
-            <w:proofErr w:type="spellStart"/>
-            <w:r>
-              <w:rPr>
-                <w:rFonts w:ascii="Times New Roman" w:hAnsi="Times New Roman" w:cs="Times New Roman"/>
-                <w:sz w:val="16"/>
-                <w:szCs w:val="16"/>
-              </w:rPr>
-              <w:t>centres</w:t>
-            </w:r>
-            <w:proofErr w:type="spellEnd"/>
-            <w:r>
-              <w:rPr>
-                <w:rFonts w:ascii="Times New Roman" w:hAnsi="Times New Roman" w:cs="Times New Roman"/>
-                <w:sz w:val="16"/>
-                <w:szCs w:val="16"/>
-              </w:rPr>
-              <w:t>)</w:t>
+                <w:rFonts w:ascii="Times New Roman" w:eastAsia="Times New Roman" w:hAnsi="Times New Roman" w:cs="Times New Roman"/>
+                <w:sz w:val="16"/>
+                <w:szCs w:val="16"/>
+              </w:rPr>
+              <w:t>pp. 15–17; Figure 1 (structural deaths, raw-to-risk-valid exclusions and patients from zero-observation centres)</w:t>
             </w:r>
           </w:p>
         </w:tc>
@@ -2506,11 +2327,11 @@
             </w:pPr>
             <w:r>
               <w:rPr>
-                <w:rFonts w:ascii="Times New Roman" w:hAnsi="Times New Roman" w:cs="Times New Roman"/>
-                <w:sz w:val="16"/>
-                <w:szCs w:val="16"/>
-              </w:rPr>
-              <w:t>Figure 1, p. 15</w:t>
+                <w:rFonts w:ascii="Times New Roman" w:eastAsia="Times New Roman" w:hAnsi="Times New Roman" w:cs="Times New Roman"/>
+                <w:sz w:val="16"/>
+                <w:szCs w:val="16"/>
+              </w:rPr>
+              <w:t>Figure 1, p. 17</w:t>
             </w:r>
           </w:p>
         </w:tc>
@@ -2609,11 +2430,11 @@
             </w:pPr>
             <w:r>
               <w:rPr>
-                <w:rFonts w:ascii="Times New Roman" w:hAnsi="Times New Roman" w:cs="Times New Roman"/>
-                <w:sz w:val="16"/>
-                <w:szCs w:val="16"/>
-              </w:rPr>
-              <w:t>Table 1, pp. 40–41</w:t>
+                <w:rFonts w:ascii="Times New Roman" w:eastAsia="Times New Roman" w:hAnsi="Times New Roman" w:cs="Times New Roman"/>
+                <w:sz w:val="16"/>
+                <w:szCs w:val="16"/>
+              </w:rPr>
+              <w:t>Table 1, pp. 42–44</w:t>
             </w:r>
           </w:p>
         </w:tc>
@@ -2712,11 +2533,11 @@
             </w:pPr>
             <w:r>
               <w:rPr>
-                <w:rFonts w:ascii="Times New Roman" w:hAnsi="Times New Roman" w:cs="Times New Roman"/>
-                <w:sz w:val="16"/>
-                <w:szCs w:val="16"/>
-              </w:rPr>
-              <w:t>p. 13; Supplementary Table S1 (clinical-variable missingness/exclusion audit); Additional file 1; Supplementary Table S8 (Day-5 RNA-seq observation)</w:t>
+                <w:rFonts w:ascii="Times New Roman" w:eastAsia="Times New Roman" w:hAnsi="Times New Roman" w:cs="Times New Roman"/>
+                <w:sz w:val="16"/>
+                <w:szCs w:val="16"/>
+              </w:rPr>
+              <w:t>p. 14; Supplementary Table S1 (clinical-variable missingness/exclusion audit); Additional file 1; Supplementary Table S8 (Day-5 RNA-seq observation)</w:t>
             </w:r>
           </w:p>
         </w:tc>
@@ -2825,7 +2646,7 @@
             </w:pPr>
             <w:r>
               <w:rPr>
-                <w:rFonts w:ascii="Times New Roman" w:hAnsi="Times New Roman" w:cs="Times New Roman"/>
+                <w:rFonts w:ascii="Times New Roman" w:eastAsia="Times New Roman" w:hAnsi="Times New Roman" w:cs="Times New Roman"/>
                 <w:sz w:val="16"/>
                 <w:szCs w:val="16"/>
               </w:rPr>
@@ -2928,11 +2749,11 @@
             </w:pPr>
             <w:r>
               <w:rPr>
-                <w:rFonts w:ascii="Times New Roman" w:hAnsi="Times New Roman" w:cs="Times New Roman"/>
-                <w:sz w:val="16"/>
-                <w:szCs w:val="16"/>
-              </w:rPr>
-              <w:t>pp. 14–15; Figure 1</w:t>
+                <w:rFonts w:ascii="Times New Roman" w:eastAsia="Times New Roman" w:hAnsi="Times New Roman" w:cs="Times New Roman"/>
+                <w:sz w:val="16"/>
+                <w:szCs w:val="16"/>
+              </w:rPr>
+              <w:t>pp. 15–17; Figure 1</w:t>
             </w:r>
           </w:p>
         </w:tc>
@@ -3031,11 +2852,11 @@
             </w:pPr>
             <w:r>
               <w:rPr>
-                <w:rFonts w:ascii="Times New Roman" w:hAnsi="Times New Roman" w:cs="Times New Roman"/>
-                <w:sz w:val="16"/>
-                <w:szCs w:val="16"/>
-              </w:rPr>
-              <w:t>pp. 16–25; Figures 2–4; Supplementary Tables S2–S7</w:t>
+                <w:rFonts w:ascii="Times New Roman" w:eastAsia="Times New Roman" w:hAnsi="Times New Roman" w:cs="Times New Roman"/>
+                <w:sz w:val="16"/>
+                <w:szCs w:val="16"/>
+              </w:rPr>
+              <w:t>pp. 16–27; Figures 2–4; Supplementary Tables S2–S7</w:t>
             </w:r>
           </w:p>
         </w:tc>
@@ -3152,29 +2973,11 @@
             </w:pPr>
             <w:r>
               <w:rPr>
-                <w:rFonts w:ascii="Times New Roman" w:hAnsi="Times New Roman" w:cs="Times New Roman"/>
-                <w:sz w:val="16"/>
-                <w:szCs w:val="16"/>
-              </w:rPr>
-              <w:t xml:space="preserve">Not applicable to the primary molecular analyses; continuous molecular features were </w:t>
-            </w:r>
-            <w:proofErr w:type="spellStart"/>
-            <w:r>
-              <w:rPr>
-                <w:rFonts w:ascii="Times New Roman" w:hAnsi="Times New Roman" w:cs="Times New Roman"/>
-                <w:sz w:val="16"/>
-                <w:szCs w:val="16"/>
-              </w:rPr>
-              <w:t>standardised</w:t>
-            </w:r>
-            <w:proofErr w:type="spellEnd"/>
-            <w:r>
-              <w:rPr>
-                <w:rFonts w:ascii="Times New Roman" w:hAnsi="Times New Roman" w:cs="Times New Roman"/>
-                <w:sz w:val="16"/>
-                <w:szCs w:val="16"/>
-              </w:rPr>
-              <w:t xml:space="preserve"> and clinical Cox contrasts used prespecified increments (pp. 7 and 9; Supplementary Table S2).</w:t>
+                <w:rFonts w:ascii="Times New Roman" w:eastAsia="Times New Roman" w:hAnsi="Times New Roman" w:cs="Times New Roman"/>
+                <w:sz w:val="16"/>
+                <w:szCs w:val="16"/>
+              </w:rPr>
+              <w:t>Not applicable to the primary molecular analyses; continuous molecular features were standardised and clinical Cox contrasts used prespecified increments (pp. 7 and 9; Supplementary Table S2).</w:t>
             </w:r>
           </w:p>
         </w:tc>
@@ -3273,29 +3076,11 @@
             </w:pPr>
             <w:r>
               <w:rPr>
-                <w:rFonts w:ascii="Times New Roman" w:hAnsi="Times New Roman" w:cs="Times New Roman"/>
-                <w:sz w:val="16"/>
-                <w:szCs w:val="16"/>
-              </w:rPr>
-              <w:t xml:space="preserve">Not applicable: the study </w:t>
-            </w:r>
-            <w:proofErr w:type="spellStart"/>
-            <w:r>
-              <w:rPr>
-                <w:rFonts w:ascii="Times New Roman" w:hAnsi="Times New Roman" w:cs="Times New Roman"/>
-                <w:sz w:val="16"/>
-                <w:szCs w:val="16"/>
-              </w:rPr>
-              <w:t>characterised</w:t>
-            </w:r>
-            <w:proofErr w:type="spellEnd"/>
-            <w:r>
-              <w:rPr>
-                <w:rFonts w:ascii="Times New Roman" w:hAnsi="Times New Roman" w:cs="Times New Roman"/>
-                <w:sz w:val="16"/>
-                <w:szCs w:val="16"/>
-              </w:rPr>
-              <w:t xml:space="preserve"> prognostic molecular associations rather than developing an absolute-risk model.</w:t>
+                <w:rFonts w:ascii="Times New Roman" w:eastAsia="Times New Roman" w:hAnsi="Times New Roman" w:cs="Times New Roman"/>
+                <w:sz w:val="16"/>
+                <w:szCs w:val="16"/>
+              </w:rPr>
+              <w:t>Not applicable: the study characterised prognostic molecular associations rather than developing an absolute-risk model.</w:t>
             </w:r>
           </w:p>
         </w:tc>
@@ -3395,11 +3180,11 @@
             </w:pPr>
             <w:r>
               <w:rPr>
-                <w:rFonts w:ascii="Times New Roman" w:hAnsi="Times New Roman" w:cs="Times New Roman"/>
-                <w:sz w:val="16"/>
-                <w:szCs w:val="16"/>
-              </w:rPr>
-              <w:t>pp. 24–25; Supplementary Table S8; Supplementary Figures A1–A9</w:t>
+                <w:rFonts w:ascii="Times New Roman" w:eastAsia="Times New Roman" w:hAnsi="Times New Roman" w:cs="Times New Roman"/>
+                <w:sz w:val="16"/>
+                <w:szCs w:val="16"/>
+              </w:rPr>
+              <w:t>pp. 18–27; Supplementary Tables S4, S6 and S8; Supplementary Figures A1–A9</w:t>
             </w:r>
           </w:p>
         </w:tc>
@@ -3508,11 +3293,11 @@
             </w:pPr>
             <w:r>
               <w:rPr>
-                <w:rFonts w:ascii="Times New Roman" w:hAnsi="Times New Roman" w:cs="Times New Roman"/>
-                <w:sz w:val="16"/>
-                <w:szCs w:val="16"/>
-              </w:rPr>
-              <w:t>pp. 25–26 (Principal findings)</w:t>
+                <w:rFonts w:ascii="Times New Roman" w:eastAsia="Times New Roman" w:hAnsi="Times New Roman" w:cs="Times New Roman"/>
+                <w:sz w:val="16"/>
+                <w:szCs w:val="16"/>
+              </w:rPr>
+              <w:t>pp. 27–28 (Principal findings)</w:t>
             </w:r>
           </w:p>
         </w:tc>
@@ -3611,11 +3396,11 @@
             </w:pPr>
             <w:r>
               <w:rPr>
-                <w:rFonts w:ascii="Times New Roman" w:hAnsi="Times New Roman" w:cs="Times New Roman"/>
-                <w:sz w:val="16"/>
-                <w:szCs w:val="16"/>
-              </w:rPr>
-              <w:t>pp. 35–37 (Strengths and limitations)</w:t>
+                <w:rFonts w:ascii="Times New Roman" w:eastAsia="Times New Roman" w:hAnsi="Times New Roman" w:cs="Times New Roman"/>
+                <w:sz w:val="16"/>
+                <w:szCs w:val="16"/>
+              </w:rPr>
+              <w:t>pp. 37–39 (Strengths and limitations)</w:t>
             </w:r>
           </w:p>
         </w:tc>
@@ -3714,11 +3499,11 @@
             </w:pPr>
             <w:r>
               <w:rPr>
-                <w:rFonts w:ascii="Times New Roman" w:hAnsi="Times New Roman" w:cs="Times New Roman"/>
-                <w:sz w:val="16"/>
-                <w:szCs w:val="16"/>
-              </w:rPr>
-              <w:t>pp. 25–37 (Discussion)</w:t>
+                <w:rFonts w:ascii="Times New Roman" w:eastAsia="Times New Roman" w:hAnsi="Times New Roman" w:cs="Times New Roman"/>
+                <w:sz w:val="16"/>
+                <w:szCs w:val="16"/>
+              </w:rPr>
+              <w:t>pp. 27–39 (Discussion)</w:t>
             </w:r>
           </w:p>
         </w:tc>
@@ -3837,11 +3622,11 @@
             </w:pPr>
             <w:r>
               <w:rPr>
-                <w:rFonts w:ascii="Times New Roman" w:hAnsi="Times New Roman" w:cs="Times New Roman"/>
-                <w:sz w:val="16"/>
-                <w:szCs w:val="16"/>
-              </w:rPr>
-              <w:t>pp. 35–37 (external validation, cohort and assay limitations)</w:t>
+                <w:rFonts w:ascii="Times New Roman" w:eastAsia="Times New Roman" w:hAnsi="Times New Roman" w:cs="Times New Roman"/>
+                <w:sz w:val="16"/>
+                <w:szCs w:val="16"/>
+              </w:rPr>
+              <w:t>pp. 36–39 (external validation, cohort and assay limitations)</w:t>
             </w:r>
           </w:p>
         </w:tc>
@@ -3940,11 +3725,11 @@
             </w:pPr>
             <w:r>
               <w:rPr>
-                <w:rFonts w:ascii="Times New Roman" w:hAnsi="Times New Roman" w:cs="Times New Roman"/>
-                <w:sz w:val="16"/>
-                <w:szCs w:val="16"/>
-              </w:rPr>
-              <w:t>p. 39 (Funding)</w:t>
+                <w:rFonts w:ascii="Times New Roman" w:eastAsia="Times New Roman" w:hAnsi="Times New Roman" w:cs="Times New Roman"/>
+                <w:sz w:val="16"/>
+                <w:szCs w:val="16"/>
+              </w:rPr>
+              <w:t>p. 41 (Funding)</w:t>
             </w:r>
           </w:p>
         </w:tc>

</xml_diff>